<commit_message>
Tests 8-13 creados, tests 14-16 pendientes
</commit_message>
<xml_diff>
--- a/Tests_Postman_QA.docx
+++ b/Tests_Postman_QA.docx
@@ -85,6 +85,7 @@
         <w:rPr>
           <w:b/>
           <w:bCs/>
+          <w:noProof/>
           <w:sz w:val="28"/>
           <w:szCs w:val="28"/>
         </w:rPr>
@@ -162,6 +163,7 @@
         <w:rPr>
           <w:b/>
           <w:bCs/>
+          <w:noProof/>
           <w:sz w:val="28"/>
           <w:szCs w:val="28"/>
         </w:rPr>
@@ -224,19 +226,8 @@
           <w:szCs w:val="28"/>
         </w:rPr>
         <w:lastRenderedPageBreak/>
-        <w:t xml:space="preserve">Registrar </w:t>
-      </w:r>
-      <w:proofErr w:type="spellStart"/>
-      <w:r>
-        <w:rPr>
-          <w:b/>
-          <w:bCs/>
-          <w:sz w:val="28"/>
-          <w:szCs w:val="28"/>
-        </w:rPr>
-        <w:t>entrenador</w:t>
-      </w:r>
-      <w:proofErr w:type="spellEnd"/>
+        <w:t>Registrar entrenador</w:t>
+      </w:r>
       <w:r>
         <w:rPr>
           <w:b/>
@@ -259,6 +250,7 @@
         <w:rPr>
           <w:b/>
           <w:bCs/>
+          <w:noProof/>
           <w:sz w:val="28"/>
           <w:szCs w:val="28"/>
         </w:rPr>
@@ -345,6 +337,7 @@
         <w:rPr>
           <w:b/>
           <w:bCs/>
+          <w:noProof/>
           <w:sz w:val="28"/>
           <w:szCs w:val="28"/>
         </w:rPr>
@@ -399,7 +392,6 @@
           <w:szCs w:val="28"/>
         </w:rPr>
       </w:pPr>
-      <w:proofErr w:type="spellStart"/>
       <w:r>
         <w:rPr>
           <w:b/>
@@ -408,49 +400,8 @@
           <w:szCs w:val="28"/>
         </w:rPr>
         <w:lastRenderedPageBreak/>
-        <w:t>Listar</w:t>
-      </w:r>
-      <w:proofErr w:type="spellEnd"/>
-      <w:r>
-        <w:rPr>
-          <w:b/>
-          <w:bCs/>
-          <w:sz w:val="28"/>
-          <w:szCs w:val="28"/>
-        </w:rPr>
-        <w:t xml:space="preserve"> </w:t>
-      </w:r>
-      <w:proofErr w:type="spellStart"/>
-      <w:r>
-        <w:rPr>
-          <w:b/>
-          <w:bCs/>
-          <w:sz w:val="28"/>
-          <w:szCs w:val="28"/>
-        </w:rPr>
-        <w:t>grupos</w:t>
-      </w:r>
-      <w:proofErr w:type="spellEnd"/>
-      <w:r>
-        <w:rPr>
-          <w:b/>
-          <w:bCs/>
-          <w:sz w:val="28"/>
-          <w:szCs w:val="28"/>
-        </w:rPr>
-        <w:t xml:space="preserve"> </w:t>
-      </w:r>
-      <w:proofErr w:type="spellStart"/>
-      <w:r>
-        <w:rPr>
-          <w:b/>
-          <w:bCs/>
-          <w:sz w:val="28"/>
-          <w:szCs w:val="28"/>
-        </w:rPr>
-        <w:t>musculares</w:t>
-      </w:r>
-      <w:proofErr w:type="spellEnd"/>
+        <w:t>Listar grupos musculares</w:t>
+      </w:r>
       <w:r>
         <w:rPr>
           <w:b/>
@@ -473,6 +424,7 @@
         <w:rPr>
           <w:b/>
           <w:bCs/>
+          <w:noProof/>
           <w:sz w:val="28"/>
           <w:szCs w:val="28"/>
         </w:rPr>
@@ -535,19 +487,8 @@
           <w:szCs w:val="28"/>
         </w:rPr>
         <w:lastRenderedPageBreak/>
-        <w:t xml:space="preserve">Crear </w:t>
-      </w:r>
-      <w:proofErr w:type="spellStart"/>
-      <w:r>
-        <w:rPr>
-          <w:b/>
-          <w:bCs/>
-          <w:sz w:val="28"/>
-          <w:szCs w:val="28"/>
-        </w:rPr>
-        <w:t>ejercicio</w:t>
-      </w:r>
-      <w:proofErr w:type="spellEnd"/>
+        <w:t>Crear ejercicio</w:t>
+      </w:r>
       <w:r>
         <w:rPr>
           <w:b/>
@@ -561,6 +502,7 @@
         <w:rPr>
           <w:b/>
           <w:bCs/>
+          <w:noProof/>
           <w:sz w:val="28"/>
           <w:szCs w:val="28"/>
         </w:rPr>
@@ -615,7 +557,6 @@
           <w:szCs w:val="28"/>
         </w:rPr>
       </w:pPr>
-      <w:proofErr w:type="spellStart"/>
       <w:r>
         <w:rPr>
           <w:b/>
@@ -624,29 +565,8 @@
           <w:szCs w:val="28"/>
         </w:rPr>
         <w:lastRenderedPageBreak/>
-        <w:t>Listar</w:t>
-      </w:r>
-      <w:proofErr w:type="spellEnd"/>
-      <w:r>
-        <w:rPr>
-          <w:b/>
-          <w:bCs/>
-          <w:sz w:val="28"/>
-          <w:szCs w:val="28"/>
-        </w:rPr>
-        <w:t xml:space="preserve"> </w:t>
-      </w:r>
-      <w:proofErr w:type="spellStart"/>
-      <w:r>
-        <w:rPr>
-          <w:b/>
-          <w:bCs/>
-          <w:sz w:val="28"/>
-          <w:szCs w:val="28"/>
-        </w:rPr>
-        <w:t>ejercicios</w:t>
-      </w:r>
-      <w:proofErr w:type="spellEnd"/>
+        <w:t>Listar ejercicios</w:t>
+      </w:r>
       <w:r>
         <w:rPr>
           <w:b/>
@@ -660,6 +580,7 @@
         <w:rPr>
           <w:b/>
           <w:bCs/>
+          <w:noProof/>
           <w:sz w:val="28"/>
           <w:szCs w:val="28"/>
         </w:rPr>
@@ -714,7 +635,6 @@
           <w:szCs w:val="28"/>
         </w:rPr>
       </w:pPr>
-      <w:proofErr w:type="spellStart"/>
       <w:r>
         <w:rPr>
           <w:b/>
@@ -723,29 +643,8 @@
           <w:szCs w:val="28"/>
         </w:rPr>
         <w:lastRenderedPageBreak/>
-        <w:t>Comprar</w:t>
-      </w:r>
-      <w:proofErr w:type="spellEnd"/>
-      <w:r>
-        <w:rPr>
-          <w:b/>
-          <w:bCs/>
-          <w:sz w:val="28"/>
-          <w:szCs w:val="28"/>
-        </w:rPr>
-        <w:t xml:space="preserve"> </w:t>
-      </w:r>
-      <w:proofErr w:type="spellStart"/>
-      <w:r>
-        <w:rPr>
-          <w:b/>
-          <w:bCs/>
-          <w:sz w:val="28"/>
-          <w:szCs w:val="28"/>
-        </w:rPr>
-        <w:t>membresia</w:t>
-      </w:r>
-      <w:proofErr w:type="spellEnd"/>
+        <w:t>Comprar membresia</w:t>
+      </w:r>
       <w:r>
         <w:rPr>
           <w:b/>
@@ -759,6 +658,7 @@
         <w:rPr>
           <w:b/>
           <w:bCs/>
+          <w:noProof/>
           <w:sz w:val="28"/>
           <w:szCs w:val="28"/>
         </w:rPr>
@@ -813,37 +713,16 @@
           <w:szCs w:val="28"/>
         </w:rPr>
       </w:pPr>
-      <w:proofErr w:type="spellStart"/>
-      <w:r>
-        <w:rPr>
-          <w:b/>
-          <w:bCs/>
-          <w:sz w:val="28"/>
-          <w:szCs w:val="28"/>
-        </w:rPr>
-        <w:t>Renovar</w:t>
-      </w:r>
-      <w:proofErr w:type="spellEnd"/>
-      <w:r>
-        <w:rPr>
-          <w:b/>
-          <w:bCs/>
-          <w:sz w:val="28"/>
-          <w:szCs w:val="28"/>
-        </w:rPr>
-        <w:t xml:space="preserve"> </w:t>
-      </w:r>
-      <w:proofErr w:type="spellStart"/>
-      <w:r>
-        <w:rPr>
-          <w:b/>
-          <w:bCs/>
-          <w:sz w:val="28"/>
-          <w:szCs w:val="28"/>
-        </w:rPr>
-        <w:t>membresia</w:t>
-      </w:r>
-      <w:proofErr w:type="spellEnd"/>
+      <w:r>
+        <w:rPr>
+          <w:b/>
+          <w:bCs/>
+          <w:sz w:val="28"/>
+          <w:szCs w:val="28"/>
+        </w:rPr>
+        <w:lastRenderedPageBreak/>
+        <w:t>Renovar membresia</w:t>
+      </w:r>
       <w:r>
         <w:rPr>
           <w:b/>
@@ -853,6 +732,460 @@
         </w:rPr>
         <w:br/>
       </w:r>
+      <w:r>
+        <w:rPr>
+          <w:b/>
+          <w:bCs/>
+          <w:sz w:val="28"/>
+          <w:szCs w:val="28"/>
+        </w:rPr>
+        <w:drawing>
+          <wp:inline distT="0" distB="0" distL="0" distR="0" wp14:anchorId="7E752683" wp14:editId="6BE1AB37">
+            <wp:extent cx="5943600" cy="5756910"/>
+            <wp:effectExtent l="0" t="0" r="0" b="0"/>
+            <wp:docPr id="242369349" name="Imagen 2"/>
+            <wp:cNvGraphicFramePr>
+              <a:graphicFrameLocks xmlns:a="http://schemas.openxmlformats.org/drawingml/2006/main" noChangeAspect="1"/>
+            </wp:cNvGraphicFramePr>
+            <a:graphic xmlns:a="http://schemas.openxmlformats.org/drawingml/2006/main">
+              <a:graphicData uri="http://schemas.openxmlformats.org/drawingml/2006/picture">
+                <pic:pic xmlns:pic="http://schemas.openxmlformats.org/drawingml/2006/picture">
+                  <pic:nvPicPr>
+                    <pic:cNvPr id="0" name="Picture 6"/>
+                    <pic:cNvPicPr>
+                      <a:picLocks noChangeAspect="1" noChangeArrowheads="1"/>
+                    </pic:cNvPicPr>
+                  </pic:nvPicPr>
+                  <pic:blipFill>
+                    <a:blip r:embed="rId13">
+                      <a:extLst>
+                        <a:ext uri="{28A0092B-C50C-407E-A947-70E740481C1C}">
+                          <a14:useLocalDpi xmlns:a14="http://schemas.microsoft.com/office/drawing/2010/main" val="0"/>
+                        </a:ext>
+                      </a:extLst>
+                    </a:blip>
+                    <a:srcRect/>
+                    <a:stretch>
+                      <a:fillRect/>
+                    </a:stretch>
+                  </pic:blipFill>
+                  <pic:spPr bwMode="auto">
+                    <a:xfrm>
+                      <a:off x="0" y="0"/>
+                      <a:ext cx="5943600" cy="5756910"/>
+                    </a:xfrm>
+                    <a:prstGeom prst="rect">
+                      <a:avLst/>
+                    </a:prstGeom>
+                    <a:noFill/>
+                    <a:ln>
+                      <a:noFill/>
+                    </a:ln>
+                  </pic:spPr>
+                </pic:pic>
+              </a:graphicData>
+            </a:graphic>
+          </wp:inline>
+        </w:drawing>
+      </w:r>
+    </w:p>
+    <w:p>
+      <w:pPr>
+        <w:pStyle w:val="Prrafodelista"/>
+        <w:numPr>
+          <w:ilvl w:val="0"/>
+          <w:numId w:val="1"/>
+        </w:numPr>
+        <w:rPr>
+          <w:b/>
+          <w:bCs/>
+          <w:sz w:val="28"/>
+          <w:szCs w:val="28"/>
+        </w:rPr>
+      </w:pPr>
+      <w:r>
+        <w:rPr>
+          <w:b/>
+          <w:bCs/>
+          <w:sz w:val="28"/>
+          <w:szCs w:val="28"/>
+        </w:rPr>
+        <w:lastRenderedPageBreak/>
+        <w:t>Registrar Asistencia</w:t>
+      </w:r>
+      <w:r>
+        <w:rPr>
+          <w:b/>
+          <w:bCs/>
+          <w:sz w:val="28"/>
+          <w:szCs w:val="28"/>
+        </w:rPr>
+        <w:br/>
+      </w:r>
+      <w:r>
+        <w:rPr>
+          <w:b/>
+          <w:bCs/>
+          <w:sz w:val="28"/>
+          <w:szCs w:val="28"/>
+        </w:rPr>
+        <w:drawing>
+          <wp:inline distT="0" distB="0" distL="0" distR="0" wp14:anchorId="4A96D8CF" wp14:editId="5DF2A0A7">
+            <wp:extent cx="5943600" cy="5807075"/>
+            <wp:effectExtent l="0" t="0" r="0" b="3175"/>
+            <wp:docPr id="384335359" name="Imagen 5"/>
+            <wp:cNvGraphicFramePr>
+              <a:graphicFrameLocks xmlns:a="http://schemas.openxmlformats.org/drawingml/2006/main" noChangeAspect="1"/>
+            </wp:cNvGraphicFramePr>
+            <a:graphic xmlns:a="http://schemas.openxmlformats.org/drawingml/2006/main">
+              <a:graphicData uri="http://schemas.openxmlformats.org/drawingml/2006/picture">
+                <pic:pic xmlns:pic="http://schemas.openxmlformats.org/drawingml/2006/picture">
+                  <pic:nvPicPr>
+                    <pic:cNvPr id="0" name="Picture 15"/>
+                    <pic:cNvPicPr>
+                      <a:picLocks noChangeAspect="1" noChangeArrowheads="1"/>
+                    </pic:cNvPicPr>
+                  </pic:nvPicPr>
+                  <pic:blipFill>
+                    <a:blip r:embed="rId14">
+                      <a:extLst>
+                        <a:ext uri="{28A0092B-C50C-407E-A947-70E740481C1C}">
+                          <a14:useLocalDpi xmlns:a14="http://schemas.microsoft.com/office/drawing/2010/main" val="0"/>
+                        </a:ext>
+                      </a:extLst>
+                    </a:blip>
+                    <a:srcRect/>
+                    <a:stretch>
+                      <a:fillRect/>
+                    </a:stretch>
+                  </pic:blipFill>
+                  <pic:spPr bwMode="auto">
+                    <a:xfrm>
+                      <a:off x="0" y="0"/>
+                      <a:ext cx="5943600" cy="5807075"/>
+                    </a:xfrm>
+                    <a:prstGeom prst="rect">
+                      <a:avLst/>
+                    </a:prstGeom>
+                    <a:noFill/>
+                    <a:ln>
+                      <a:noFill/>
+                    </a:ln>
+                  </pic:spPr>
+                </pic:pic>
+              </a:graphicData>
+            </a:graphic>
+          </wp:inline>
+        </w:drawing>
+      </w:r>
+    </w:p>
+    <w:p>
+      <w:pPr>
+        <w:pStyle w:val="Prrafodelista"/>
+        <w:numPr>
+          <w:ilvl w:val="0"/>
+          <w:numId w:val="1"/>
+        </w:numPr>
+        <w:rPr>
+          <w:b/>
+          <w:bCs/>
+          <w:sz w:val="28"/>
+          <w:szCs w:val="28"/>
+        </w:rPr>
+      </w:pPr>
+      <w:r>
+        <w:rPr>
+          <w:b/>
+          <w:bCs/>
+          <w:sz w:val="28"/>
+          <w:szCs w:val="28"/>
+        </w:rPr>
+        <w:t>Historial de asistencias</w:t>
+      </w:r>
+      <w:r>
+        <w:rPr>
+          <w:b/>
+          <w:bCs/>
+          <w:sz w:val="28"/>
+          <w:szCs w:val="28"/>
+        </w:rPr>
+        <w:br/>
+      </w:r>
+      <w:r>
+        <w:rPr>
+          <w:b/>
+          <w:bCs/>
+          <w:sz w:val="28"/>
+          <w:szCs w:val="28"/>
+        </w:rPr>
+        <w:br/>
+      </w:r>
+      <w:r>
+        <w:rPr>
+          <w:b/>
+          <w:bCs/>
+          <w:sz w:val="28"/>
+          <w:szCs w:val="28"/>
+        </w:rPr>
+        <w:lastRenderedPageBreak/>
+        <w:br/>
+      </w:r>
+      <w:r>
+        <w:rPr>
+          <w:b/>
+          <w:bCs/>
+          <w:sz w:val="28"/>
+          <w:szCs w:val="28"/>
+        </w:rPr>
+        <w:drawing>
+          <wp:inline distT="0" distB="0" distL="0" distR="0" wp14:anchorId="00D7AEFB" wp14:editId="2D542264">
+            <wp:extent cx="5943600" cy="5560695"/>
+            <wp:effectExtent l="0" t="0" r="0" b="1905"/>
+            <wp:docPr id="1012450688" name="Imagen 9"/>
+            <wp:cNvGraphicFramePr>
+              <a:graphicFrameLocks xmlns:a="http://schemas.openxmlformats.org/drawingml/2006/main" noChangeAspect="1"/>
+            </wp:cNvGraphicFramePr>
+            <a:graphic xmlns:a="http://schemas.openxmlformats.org/drawingml/2006/main">
+              <a:graphicData uri="http://schemas.openxmlformats.org/drawingml/2006/picture">
+                <pic:pic xmlns:pic="http://schemas.openxmlformats.org/drawingml/2006/picture">
+                  <pic:nvPicPr>
+                    <pic:cNvPr id="0" name="Picture 29"/>
+                    <pic:cNvPicPr>
+                      <a:picLocks noChangeAspect="1" noChangeArrowheads="1"/>
+                    </pic:cNvPicPr>
+                  </pic:nvPicPr>
+                  <pic:blipFill>
+                    <a:blip r:embed="rId15">
+                      <a:extLst>
+                        <a:ext uri="{28A0092B-C50C-407E-A947-70E740481C1C}">
+                          <a14:useLocalDpi xmlns:a14="http://schemas.microsoft.com/office/drawing/2010/main" val="0"/>
+                        </a:ext>
+                      </a:extLst>
+                    </a:blip>
+                    <a:srcRect/>
+                    <a:stretch>
+                      <a:fillRect/>
+                    </a:stretch>
+                  </pic:blipFill>
+                  <pic:spPr bwMode="auto">
+                    <a:xfrm>
+                      <a:off x="0" y="0"/>
+                      <a:ext cx="5943600" cy="5560695"/>
+                    </a:xfrm>
+                    <a:prstGeom prst="rect">
+                      <a:avLst/>
+                    </a:prstGeom>
+                    <a:noFill/>
+                    <a:ln>
+                      <a:noFill/>
+                    </a:ln>
+                  </pic:spPr>
+                </pic:pic>
+              </a:graphicData>
+            </a:graphic>
+          </wp:inline>
+        </w:drawing>
+      </w:r>
+    </w:p>
+    <w:p>
+      <w:pPr>
+        <w:pStyle w:val="Prrafodelista"/>
+        <w:rPr>
+          <w:b/>
+          <w:bCs/>
+          <w:sz w:val="28"/>
+          <w:szCs w:val="28"/>
+        </w:rPr>
+      </w:pPr>
+    </w:p>
+    <w:p>
+      <w:pPr>
+        <w:pStyle w:val="Prrafodelista"/>
+        <w:numPr>
+          <w:ilvl w:val="0"/>
+          <w:numId w:val="1"/>
+        </w:numPr>
+        <w:rPr>
+          <w:b/>
+          <w:bCs/>
+          <w:sz w:val="28"/>
+          <w:szCs w:val="28"/>
+        </w:rPr>
+      </w:pPr>
+      <w:r>
+        <w:rPr>
+          <w:b/>
+          <w:bCs/>
+          <w:sz w:val="28"/>
+          <w:szCs w:val="28"/>
+        </w:rPr>
+        <w:lastRenderedPageBreak/>
+        <w:t>Estado del usuario</w:t>
+      </w:r>
+      <w:r>
+        <w:rPr>
+          <w:b/>
+          <w:bCs/>
+          <w:sz w:val="28"/>
+          <w:szCs w:val="28"/>
+        </w:rPr>
+        <w:br/>
+      </w:r>
+      <w:r>
+        <w:rPr>
+          <w:b/>
+          <w:bCs/>
+          <w:sz w:val="28"/>
+          <w:szCs w:val="28"/>
+        </w:rPr>
+        <w:drawing>
+          <wp:inline distT="0" distB="0" distL="0" distR="0" wp14:anchorId="7CF4E276" wp14:editId="390B20C6">
+            <wp:extent cx="5943600" cy="4248150"/>
+            <wp:effectExtent l="0" t="0" r="0" b="0"/>
+            <wp:docPr id="1153459274" name="Imagen 7"/>
+            <wp:cNvGraphicFramePr>
+              <a:graphicFrameLocks xmlns:a="http://schemas.openxmlformats.org/drawingml/2006/main" noChangeAspect="1"/>
+            </wp:cNvGraphicFramePr>
+            <a:graphic xmlns:a="http://schemas.openxmlformats.org/drawingml/2006/main">
+              <a:graphicData uri="http://schemas.openxmlformats.org/drawingml/2006/picture">
+                <pic:pic xmlns:pic="http://schemas.openxmlformats.org/drawingml/2006/picture">
+                  <pic:nvPicPr>
+                    <pic:cNvPr id="0" name="Picture 22"/>
+                    <pic:cNvPicPr>
+                      <a:picLocks noChangeAspect="1" noChangeArrowheads="1"/>
+                    </pic:cNvPicPr>
+                  </pic:nvPicPr>
+                  <pic:blipFill>
+                    <a:blip r:embed="rId16">
+                      <a:extLst>
+                        <a:ext uri="{28A0092B-C50C-407E-A947-70E740481C1C}">
+                          <a14:useLocalDpi xmlns:a14="http://schemas.microsoft.com/office/drawing/2010/main" val="0"/>
+                        </a:ext>
+                      </a:extLst>
+                    </a:blip>
+                    <a:srcRect/>
+                    <a:stretch>
+                      <a:fillRect/>
+                    </a:stretch>
+                  </pic:blipFill>
+                  <pic:spPr bwMode="auto">
+                    <a:xfrm>
+                      <a:off x="0" y="0"/>
+                      <a:ext cx="5943600" cy="4248150"/>
+                    </a:xfrm>
+                    <a:prstGeom prst="rect">
+                      <a:avLst/>
+                    </a:prstGeom>
+                    <a:noFill/>
+                    <a:ln>
+                      <a:noFill/>
+                    </a:ln>
+                  </pic:spPr>
+                </pic:pic>
+              </a:graphicData>
+            </a:graphic>
+          </wp:inline>
+        </w:drawing>
+      </w:r>
+    </w:p>
+    <w:p>
+      <w:pPr>
+        <w:pStyle w:val="Prrafodelista"/>
+        <w:rPr>
+          <w:b/>
+          <w:bCs/>
+          <w:sz w:val="28"/>
+          <w:szCs w:val="28"/>
+        </w:rPr>
+      </w:pPr>
+    </w:p>
+    <w:p>
+      <w:pPr>
+        <w:pStyle w:val="Prrafodelista"/>
+        <w:numPr>
+          <w:ilvl w:val="0"/>
+          <w:numId w:val="1"/>
+        </w:numPr>
+        <w:rPr>
+          <w:b/>
+          <w:bCs/>
+          <w:sz w:val="28"/>
+          <w:szCs w:val="28"/>
+        </w:rPr>
+      </w:pPr>
+      <w:r>
+        <w:rPr>
+          <w:b/>
+          <w:bCs/>
+          <w:sz w:val="28"/>
+          <w:szCs w:val="28"/>
+        </w:rPr>
+        <w:lastRenderedPageBreak/>
+        <w:t xml:space="preserve"> Crear rutina personalizada</w:t>
+      </w:r>
+      <w:r>
+        <w:rPr>
+          <w:b/>
+          <w:bCs/>
+          <w:sz w:val="28"/>
+          <w:szCs w:val="28"/>
+        </w:rPr>
+        <w:br/>
+      </w:r>
+      <w:r>
+        <w:rPr>
+          <w:b/>
+          <w:bCs/>
+          <w:sz w:val="28"/>
+          <w:szCs w:val="28"/>
+        </w:rPr>
+        <w:drawing>
+          <wp:inline distT="0" distB="0" distL="0" distR="0" wp14:anchorId="4610C468" wp14:editId="0353D507">
+            <wp:extent cx="5943600" cy="5483225"/>
+            <wp:effectExtent l="0" t="0" r="0" b="3175"/>
+            <wp:docPr id="345482840" name="Imagen 1"/>
+            <wp:cNvGraphicFramePr>
+              <a:graphicFrameLocks xmlns:a="http://schemas.openxmlformats.org/drawingml/2006/main" noChangeAspect="1"/>
+            </wp:cNvGraphicFramePr>
+            <a:graphic xmlns:a="http://schemas.openxmlformats.org/drawingml/2006/main">
+              <a:graphicData uri="http://schemas.openxmlformats.org/drawingml/2006/picture">
+                <pic:pic xmlns:pic="http://schemas.openxmlformats.org/drawingml/2006/picture">
+                  <pic:nvPicPr>
+                    <pic:cNvPr id="345482840" name=""/>
+                    <pic:cNvPicPr/>
+                  </pic:nvPicPr>
+                  <pic:blipFill>
+                    <a:blip r:embed="rId17"/>
+                    <a:stretch>
+                      <a:fillRect/>
+                    </a:stretch>
+                  </pic:blipFill>
+                  <pic:spPr>
+                    <a:xfrm>
+                      <a:off x="0" y="0"/>
+                      <a:ext cx="5943600" cy="5483225"/>
+                    </a:xfrm>
+                    <a:prstGeom prst="rect">
+                      <a:avLst/>
+                    </a:prstGeom>
+                  </pic:spPr>
+                </pic:pic>
+              </a:graphicData>
+            </a:graphic>
+          </wp:inline>
+        </w:drawing>
+      </w:r>
+    </w:p>
+    <w:p>
+      <w:pPr>
+        <w:pStyle w:val="Prrafodelista"/>
+        <w:rPr>
+          <w:b/>
+          <w:bCs/>
+          <w:sz w:val="28"/>
+          <w:szCs w:val="28"/>
+        </w:rPr>
+      </w:pPr>
       <w:r>
         <w:rPr>
           <w:b/>
@@ -1582,7 +1915,6 @@
   <w:style w:type="character" w:default="1" w:styleId="Fuentedeprrafopredeter">
     <w:name w:val="Default Paragraph Font"/>
     <w:uiPriority w:val="1"/>
-    <w:semiHidden/>
     <w:unhideWhenUsed/>
   </w:style>
   <w:style w:type="table" w:default="1" w:styleId="Tablanormal">
@@ -1894,6 +2226,17 @@
       <w:smallCaps/>
       <w:color w:val="2F5496" w:themeColor="accent1" w:themeShade="BF"/>
       <w:spacing w:val="5"/>
+    </w:rPr>
+  </w:style>
+  <w:style w:type="paragraph" w:styleId="NormalWeb">
+    <w:name w:val="Normal (Web)"/>
+    <w:basedOn w:val="Normal"/>
+    <w:uiPriority w:val="99"/>
+    <w:semiHidden/>
+    <w:unhideWhenUsed/>
+    <w:rsid w:val="00B64493"/>
+    <w:rPr>
+      <w:rFonts w:ascii="Times New Roman" w:hAnsi="Times New Roman" w:cs="Times New Roman"/>
     </w:rPr>
   </w:style>
 </w:styles>

</xml_diff>